<commit_message>
Regenerate the canonical 5-6-7 pack now that Word has released it
f27b894 pushed a stale BLITZ-POSTS-5-6-7.docx: the generator was fixed but
python-docx could not overwrite a file Word had open, and the chain committed
anyway because the failed extraction check did not gate the commit. This time
the commit runs only if the build and the extraction check both exit zero.
Verified by text extraction: no "several", no 265, "one or more" three times.

Co-Authored-By: Claude Fable 5.1 <noreply@anthropic.com>
Claude-Session: https://claude.ai/code/session_01M4Z6V3c3eMgko9FCs2dnki
</commit_message>
<xml_diff>
--- a/docs/launch/BLITZ-POSTS-5-6-7.docx
+++ b/docs/launch/BLITZ-POSTS-5-6-7.docx
@@ -546,7 +546,7 @@
         <w:shd w:val="clear" w:fill="F2F4F5"/>
       </w:pPr>
       <w:r>
-        <w:t>We read your site. We ask four answer engines your buyers' questions, several times each, with web search on. We keep search-grounded answers separate from ones the model produced from memory, because blending them moves a score invisibly.</w:t>
+        <w:t>We read your site. We ask four answer engines your buyers' questions with web search on — one or more times each, depending on how many questions you ask, and the per-cell N is printed on every number. We keep search-grounded answers separate from ones the model produced from memory, because blending them moves a score invisibly.</w:t>
       </w:r>
     </w:p>
     <w:p>
@@ -1071,7 +1071,7 @@
         <w:pStyle w:val="Heading2"/>
       </w:pPr>
       <w:r>
-        <w:t>6 · How AEO Analyzers works  —  275/280</w:t>
+        <w:t>6 · How AEO Analyzers works  —  279/280</w:t>
       </w:r>
     </w:p>
     <w:p>
@@ -1091,7 +1091,7 @@
         <w:shd w:val="clear" w:fill="F2F4F5"/>
       </w:pPr>
       <w:r>
-        <w:t>Four engines, buyers' questions, several runs each. Search-grounded answers kept separate from memory. Three layers scored separately, every number backed by a stored transcript you can re-run.</w:t>
+        <w:t>Four engines, buyers' questions, one or more runs each. Search-grounded answers kept separate from memory. Three layers scored separately, every number backed by a stored transcript you can re-run.</w:t>
       </w:r>
     </w:p>
     <w:p>
@@ -1422,7 +1422,7 @@
         <w:pStyle w:val="Heading2"/>
       </w:pPr>
       <w:r>
-        <w:t>6 · How AEO Analyzers works  —  248/300</w:t>
+        <w:t>6 · How AEO Analyzers works  —  252/300</w:t>
       </w:r>
     </w:p>
     <w:p>
@@ -1442,7 +1442,7 @@
         <w:shd w:val="clear" w:fill="F2F4F5"/>
       </w:pPr>
       <w:r>
-        <w:t>Four engines, your buyers' questions, several runs each. Three layers scored separately. Every number backed by a stored transcript you can re-run.</w:t>
+        <w:t>Four engines, your buyers' questions, one or more runs each. Three layers scored separately. Every number backed by a stored transcript you can re-run.</w:t>
       </w:r>
     </w:p>
     <w:p>

</xml_diff>